<commit_message>
fix(docx): re-aplica bold no titulo + recuo no texto (perdidos no commit anterior)
O fix-template-loop.mjs do commit fb4d707 leu uma versão DESATUALIZADA
do template (arquivo local estava locked, então sourceou do que tinha
sido commitado em 24dcec5 — que já tinha sido sobrescrito por outro
commit no meio do processo). Resultado: o template novo com loop de
parágrafos perdeu as alterações de bold + recuo.

Agora aplico ambos diretamente no template em git HEAD:
- {titulo}: <w:rPr><w:b/><w:bCs/>...</w:rPr> em todos os 3 runs
- {texto}: <w:pPr>...<w:ind w:firstLine="708"/></w:pPr>

Verificado: 16 ocorrências de <w:b/> (12 pré-existentes para
labels + 3 novas pro titulo + 1 outras), 1 ocorrência de
firstLine="708" (no parágrafo do {texto} dentro do loop
{#paragrafos}{/paragrafos}).

Co-Authored-By: Claude Opus 4.7 (1M context) <noreply@anthropic.com>
</commit_message>
<xml_diff>
--- a/public/template-proposta-padrao.docx
+++ b/public/template-proposta-padrao.docx
@@ -236,12 +236,16 @@
         <w:spacing w:after="100"/>
         <w:jc w:val="both"/>
         <w:rPr>
-          <w:sz w:val="22"/>
-          <w:szCs w:val="22"/>
-        </w:rPr>
-      </w:pPr>
-      <w:r>
-        <w:rPr>
+          <w:b/>
+          <w:bCs/>
+          <w:sz w:val="22"/>
+          <w:szCs w:val="22"/>
+        </w:rPr>
+      </w:pPr>
+      <w:r>
+        <w:rPr>
+          <w:b/>
+          <w:bCs/>
           <w:sz w:val="22"/>
           <w:szCs w:val="22"/>
         </w:rPr>
@@ -250,6 +254,8 @@
       <w:proofErr w:type="spellStart"/>
       <w:r>
         <w:rPr>
+          <w:b/>
+          <w:bCs/>
           <w:sz w:val="22"/>
           <w:szCs w:val="22"/>
         </w:rPr>
@@ -258,6 +264,8 @@
       <w:proofErr w:type="spellEnd"/>
       <w:r>
         <w:rPr>
+          <w:b/>
+          <w:bCs/>
           <w:sz w:val="22"/>
           <w:szCs w:val="22"/>
         </w:rPr>
@@ -282,6 +290,7 @@
           <w:sz w:val="22"/>
           <w:szCs w:val="22"/>
         </w:rPr>
+        <w:ind w:firstLine="708"/>
       </w:pPr>
       <w:r>
         <w:rPr>

</xml_diff>

<commit_message>
feat: filtro de município com IBGE + click-through em cards de empresa
- Substitui input texto livre por combobox multi-select com API IBGE (cache 30 dias localStorage)
- Adiciona toggle "Interior" que exclui capitais das UFs selecionadas
- Chips individuais por município selecionado e chip "Interior"
- Clicar no nome da empresa em Ações Tributárias, Prospecção Kanban e Matriz Elegibilidade abre EmpresaDetailSheet completo
- EmpresaQuickSheet: wrapper que busca empresa por ID sob demanda com skeleton de loading

Co-Authored-By: Claude Sonnet 4.6 <noreply@anthropic.com>
</commit_message>
<xml_diff>
--- a/public/template-proposta-padrao.docx
+++ b/public/template-proposta-padrao.docx
@@ -236,16 +236,12 @@
         <w:spacing w:after="100"/>
         <w:jc w:val="both"/>
         <w:rPr>
-          <w:b/>
-          <w:bCs/>
-          <w:sz w:val="22"/>
-          <w:szCs w:val="22"/>
-        </w:rPr>
-      </w:pPr>
-      <w:r>
-        <w:rPr>
-          <w:b/>
-          <w:bCs/>
+          <w:sz w:val="22"/>
+          <w:szCs w:val="22"/>
+        </w:rPr>
+      </w:pPr>
+      <w:r>
+        <w:rPr>
           <w:sz w:val="22"/>
           <w:szCs w:val="22"/>
         </w:rPr>
@@ -254,8 +250,6 @@
       <w:proofErr w:type="spellStart"/>
       <w:r>
         <w:rPr>
-          <w:b/>
-          <w:bCs/>
           <w:sz w:val="22"/>
           <w:szCs w:val="22"/>
         </w:rPr>
@@ -264,22 +258,10 @@
       <w:proofErr w:type="spellEnd"/>
       <w:r>
         <w:rPr>
-          <w:b/>
-          <w:bCs/>
           <w:sz w:val="22"/>
           <w:szCs w:val="22"/>
         </w:rPr>
         <w:t>}</w:t>
-      </w:r>
-    </w:p>
-    <w:p>
-      <w:pPr/>
-      <w:r>
-        <w:rPr>
-          <w:sz w:val="22"/>
-          <w:szCs w:val="22"/>
-        </w:rPr>
-        <w:t>{#paragrafos}</w:t>
       </w:r>
     </w:p>
     <w:p>
@@ -290,23 +272,29 @@
           <w:sz w:val="22"/>
           <w:szCs w:val="22"/>
         </w:rPr>
-        <w:ind w:firstLine="708"/>
-      </w:pPr>
-      <w:r>
-        <w:rPr>
-          <w:sz w:val="22"/>
-          <w:szCs w:val="22"/>
-        </w:rPr>
-        <w:t>{texto}</w:t>
-      </w:r>
-    </w:p>
-    <w:p>
-      <w:r>
-        <w:rPr>
-          <w:sz w:val="22"/>
-          <w:szCs w:val="22"/>
-        </w:rPr>
-        <w:t>{/paragrafos}</w:t>
+      </w:pPr>
+      <w:r>
+        <w:rPr>
+          <w:sz w:val="22"/>
+          <w:szCs w:val="22"/>
+        </w:rPr>
+        <w:t>{</w:t>
+      </w:r>
+      <w:proofErr w:type="spellStart"/>
+      <w:r>
+        <w:rPr>
+          <w:sz w:val="22"/>
+          <w:szCs w:val="22"/>
+        </w:rPr>
+        <w:t>conteudo_texto</w:t>
+      </w:r>
+      <w:proofErr w:type="spellEnd"/>
+      <w:r>
+        <w:rPr>
+          <w:sz w:val="22"/>
+          <w:szCs w:val="22"/>
+        </w:rPr>
+        <w:t>}</w:t>
       </w:r>
     </w:p>
     <w:p>

</xml_diff>